<commit_message>
Ajustes do Internoh e Uploads
</commit_message>
<xml_diff>
--- a/uploads/Proposta/PropostaPLANO C_AGRISHOW_.docx
+++ b/uploads/Proposta/PropostaPLANO C_AGRISHOW_.docx
@@ -389,7 +389,7 @@
                 <w:szCs w:val="24"/>
                 <w:u w:val="single"/>
               </w:rPr>
-              <w:t xml:space="preserve">13/04/2026 ATÉ: 13/04/2026</w:t>
+              <w:t xml:space="preserve">11/04/2027 ATÉ: 11/04/2027</w:t>
             </w:r>
           </w:p>
         </w:tc>
@@ -445,7 +445,7 @@
                 <w:szCs w:val="24"/>
                 <w:u w:val="single"/>
               </w:rPr>
-              <w:t xml:space="preserve">14/04/2026 ATÉ: 26/04/2026</w:t>
+              <w:t xml:space="preserve">12/04/2027 ATÉ: 24/04/2027</w:t>
             </w:r>
           </w:p>
         </w:tc>
@@ -501,7 +501,7 @@
                 <w:szCs w:val="24"/>
                 <w:u w:val="single"/>
               </w:rPr>
-              <w:t xml:space="preserve">27/04/2026 ATÉ: 01/05/2026</w:t>
+              <w:t xml:space="preserve">26/05/2027 ATÉ: 30/05/2027</w:t>
             </w:r>
           </w:p>
         </w:tc>
@@ -564,7 +564,7 @@
                 <w:szCs w:val="24"/>
                 <w:u w:val="single"/>
               </w:rPr>
-              <w:t xml:space="preserve">02/05/2026 ATÉ: 15/05/2026</w:t>
+              <w:t xml:space="preserve">01/05/2027 ATÉ: 14/05/2027</w:t>
             </w:r>
           </w:p>
         </w:tc>
@@ -952,7 +952,7 @@
           <w:sz w:val="24"/>
           <w:szCs w:val="24"/>
         </w:rPr>
-        <w:t xml:space="preserve">• 2 Controller Better Stands, (DESMONTAGEM), 9 Diária(s), de: 01/05/2026 até: 09/05/2026</w:t>
+        <w:t xml:space="preserve">• 2 Controller Better Stands, (DESMONTAGEM), 9 Diária(s), de: 01/05/2027 até: 09/05/2027</w:t>
       </w:r>
     </w:p>
     <w:p>
@@ -972,7 +972,7 @@
           <w:sz w:val="24"/>
           <w:szCs w:val="24"/>
         </w:rPr>
-        <w:t xml:space="preserve">• 1 Coordenador Better Stand, (DESMONTAGEM), 15 Diária(s), de: 01/05/2026 até: 15/05/2026</w:t>
+        <w:t xml:space="preserve">• 1 Coordenador Better Stand, (DESMONTAGEM), 15 Diária(s), de: 01/05/2027 até: 15/05/2027</w:t>
       </w:r>
     </w:p>
     <w:p>
@@ -992,7 +992,7 @@
           <w:sz w:val="24"/>
           <w:szCs w:val="24"/>
         </w:rPr>
-        <w:t xml:space="preserve">• 2 Controller Better Stands, (MONTAGEM), 16 Diária(s), de: 12/04/2026 até: 27/04/2026</w:t>
+        <w:t xml:space="preserve">• 4 Controller Better Stands, (ENTREGA DE SELOS), 5 Diária(s), de: 26/05/2027 até: 30/05/2027</w:t>
       </w:r>
     </w:p>
     <w:p>
@@ -1012,7 +1012,7 @@
           <w:sz w:val="24"/>
           <w:szCs w:val="24"/>
         </w:rPr>
-        <w:t xml:space="preserve">• 1 Coordenador Better Stand, (MONTAGEM), 16 Diária(s), de: 12/04/2026 até: 27/04/2026</w:t>
+        <w:t xml:space="preserve">• 2 Controller Better Stands, (MONTAGEM), 16 Diária(s), de: 12/04/2027 até: 27/04/2027</w:t>
       </w:r>
     </w:p>
     <w:p>
@@ -1032,7 +1032,27 @@
           <w:sz w:val="24"/>
           <w:szCs w:val="24"/>
         </w:rPr>
-        <w:t xml:space="preserve">• 1 Analista De Better Standes - J A, (PRE EVENTO), 5 Diária(s), de: 06/04/2026 até: 10/04/2026</w:t>
+        <w:t xml:space="preserve">• 1 Coordenador Better Stand, (MONTAGEM), 16 Diária(s), de: 12/04/2027 até: 27/04/2027</w:t>
+      </w:r>
+    </w:p>
+    <w:p>
+      <w:pPr>
+        <w:pStyle w:val="PargrafodaLista"/>
+        <w:spacing w:line="285" w:lineRule="atLeast"/>
+        <w:ind w:left="0"/>
+        <w:rPr>
+          <w:rFonts w:ascii="Abel" w:hAnsi="Abel"/>
+          <w:sz w:val="24"/>
+          <w:szCs w:val="24"/>
+        </w:rPr>
+      </w:pPr>
+      <w:r>
+        <w:rPr>
+          <w:rFonts w:ascii="Abel" w:hAnsi="Abel"/>
+          <w:sz w:val="24"/>
+          <w:szCs w:val="24"/>
+        </w:rPr>
+        <w:t xml:space="preserve">• 1 Analista De Better Standes - J A, (PRE EVENTO), 8 Diária(s), de: 03/04/2027 até: 10/04/2027</w:t>
       </w:r>
     </w:p>
     <w:p>
@@ -1289,7 +1309,7 @@
           <w:sz w:val="24"/>
           <w:szCs w:val="24"/>
         </w:rPr>
-        <w:t xml:space="preserve">2026</w:t>
+        <w:t xml:space="preserve">2027</w:t>
       </w:r>
       <w:r>
         <w:rPr>
@@ -1307,7 +1327,7 @@
           <w:sz w:val="24"/>
           <w:szCs w:val="24"/>
         </w:rPr>
-        <w:t xml:space="preserve">R$ 69.617,08</w:t>
+        <w:t xml:space="preserve">R$ 79.683,60</w:t>
       </w:r>
       <w:r>
         <w:rPr>
@@ -1486,7 +1506,7 @@
           <w:i/>
           <w:iCs/>
         </w:rPr>
-        <w:t xml:space="preserve">05/03/2026</w:t>
+        <w:t xml:space="preserve">29/09/2026</w:t>
       </w:r>
     </w:p>
     <w:p>

</xml_diff>